<commit_message>
chore: rename portal brand to Chaka
</commit_message>
<xml_diff>
--- a/docs/დავალება-1-პროექტის-იდეა.docx
+++ b/docs/დავალება-1-პროექტის-იდეა.docx
@@ -15,7 +15,7 @@
         <w:rPr>
           <w:b/>
         </w:rPr>
-        <w:t>პროექტი: ვიტა — სამედიცინო პორტალი</w:t>
+        <w:t>პროექტი: ჩაკა — სამედიცინო პორტალი</w:t>
       </w:r>
     </w:p>
     <w:p>
@@ -31,7 +31,7 @@
         <w:rPr>
           <w:b w:val="0"/>
         </w:rPr>
-        <w:t>„ვიტა“ (VITA) არის მრავალპროფილური, ინტერაქტიული სამედიცინო ვებ-პორტალი, რომელიც ერთ სივრცეში აერთიანებს სიმპტომების რუკას, ექიმების კატალოგს, საქართველოს კლინიკების რუკას, ონლაინ სამედიცინო კალკულატორებს, პირველადი დახმარების ინსტრუქციებს და სამედიცინო ბიბლიოთეკას. პროექტი იქმნება იმისთვის, რომ ჯანმრთელობასთან დაკავშირებული სანდო ინფორმაცია და მარტივი ხელსაწყოები ყველასთვის გასაგებად და ხელმისაწვდომად იყოს თავმოყრილი.</w:t>
+        <w:t>„ჩაკა“ (CHAKA) არის მრავალპროფილური, ინტერაქტიული სამედიცინო ვებ-პორტალი, რომელიც ერთ სივრცეში აერთიანებს სიმპტომების რუკას, ექიმების კატალოგს, საქართველოს კლინიკების რუკას, ონლაინ სამედიცინო კალკულატორებს, პირველადი დახმარების ინსტრუქციებს და სამედიცინო ბიბლიოთეკას. პროექტი იქმნება იმისთვის, რომ ჯანმრთელობასთან დაკავშირებული სანდო ინფორმაცია და მარტივი ხელსაწყოები ყველასთვის გასაგებად და ხელმისაწვდომად იყოს თავმოყრილი.</w:t>
       </w:r>
     </w:p>
     <w:p>

</xml_diff>